<commit_message>
Phase the later requests into four two-week sprints over two months.
Keep the junior on the baseline tasks until that base is accepted.
</commit_message>
<xml_diff>
--- a/docs/proposal/SoftBuilds Proposal for Travel With Moeen.docx
+++ b/docs/proposal/SoftBuilds Proposal for Travel With Moeen.docx
@@ -4,14 +4,11 @@
   <w:body>
     <w:p>
       <w:pPr>
-        <w:spacing w:after="0" w:line="240" w:lineRule="auto"/>
-      </w:pPr>
-      <w:r>
-        <w:rPr>
-          <w:noProof/>
-        </w:rPr>
+        <w:spacing w:before="0" w:after="0" w:line="240" w:lineRule="auto"/>
+      </w:pPr>
+      <w:r>
         <w:drawing>
-          <wp:anchor distT="0" distB="0" distL="0" distR="0" simplePos="0" relativeHeight="251659264" behindDoc="0" locked="0" layoutInCell="1" allowOverlap="1" wp14:anchorId="0F237D47" wp14:editId="5F89C5A9">
+          <wp:anchor distT="0" distB="0" distL="0" distR="0" simplePos="0" relativeHeight="251659264" behindDoc="0" locked="0" layoutInCell="1" allowOverlap="1">
             <wp:simplePos x="0" y="0"/>
             <wp:positionH relativeFrom="page">
               <wp:posOffset>0</wp:posOffset>
@@ -23,18 +20,18 @@
             <wp:effectExtent l="0" t="0" r="0" b="0"/>
             <wp:wrapNone/>
             <wp:docPr id="1" name="Picture 1"/>
-            <wp:cNvGraphicFramePr>
-              <a:graphicFrameLocks xmlns:a="http://schemas.openxmlformats.org/drawingml/2006/main" noChangeAspect="1"/>
+            <wp:cNvGraphicFramePr xmlns:a="http://schemas.openxmlformats.org/drawingml/2006/main">
+              <a:graphicFrameLocks noChangeAspect="1"/>
             </wp:cNvGraphicFramePr>
-            <a:graphic xmlns:a="http://schemas.openxmlformats.org/drawingml/2006/main">
+            <a:graphic xmlns:a="http://schemas.openxmlformats.org/drawingml/2006/main" xmlns:pic="http://schemas.openxmlformats.org/drawingml/2006/picture">
               <a:graphicData uri="http://schemas.openxmlformats.org/drawingml/2006/picture">
-                <pic:pic xmlns:pic="http://schemas.openxmlformats.org/drawingml/2006/picture">
+                <pic:pic>
                   <pic:nvPicPr>
                     <pic:cNvPr id="0" name="_cover_page.png"/>
                     <pic:cNvPicPr/>
                   </pic:nvPicPr>
                   <pic:blipFill>
-                    <a:blip r:embed="rId8"/>
+                    <a:blip r:embed="rId18"/>
                     <a:stretch>
                       <a:fillRect/>
                     </a:stretch>
@@ -44,9 +41,7 @@
                       <a:off x="0" y="0"/>
                       <a:ext cx="7560310" cy="10692130"/>
                     </a:xfrm>
-                    <a:prstGeom prst="rect">
-                      <a:avLst/>
-                    </a:prstGeom>
+                    <a:prstGeom prst="rect"/>
                   </pic:spPr>
                 </pic:pic>
               </a:graphicData>
@@ -368,6 +363,186 @@
           </w:p>
         </w:tc>
       </w:tr>
+      <w:tr>
+        <w:trPr>
+          <w:cantSplit/>
+          <w:jc w:val="center"/>
+        </w:trPr>
+        <w:tc>
+          <w:tcPr>
+            <w:tcW w:w="3137" w:type="dxa"/>
+            <w:tcBorders>
+              <w:top w:val="single" w:sz="4" w:space="0" w:color="E6EEF2"/>
+              <w:left w:val="single" w:sz="4" w:space="0" w:color="E6EEF2"/>
+              <w:bottom w:val="single" w:sz="4" w:space="0" w:color="E6EEF2"/>
+              <w:right w:val="single" w:sz="4" w:space="0" w:color="E6EEF2"/>
+            </w:tcBorders>
+            <w:tcMar>
+              <w:top w:w="60" w:type="dxa"/>
+              <w:left w:w="80" w:type="dxa"/>
+              <w:bottom w:w="60" w:type="dxa"/>
+              <w:right w:w="80" w:type="dxa"/>
+            </w:tcMar>
+          </w:tcPr>
+          <w:p>
+            <w:pPr>
+              <w:spacing w:after="0" w:line="259" w:lineRule="auto"/>
+            </w:pPr>
+            <w:r>
+              <w:rPr>
+                <w:sz w:val="20"/>
+              </w:rPr>
+              <w:t>1.2</w:t>
+            </w:r>
+          </w:p>
+        </w:tc>
+        <w:tc>
+          <w:tcPr>
+            <w:tcW w:w="3137" w:type="dxa"/>
+            <w:tcBorders>
+              <w:top w:val="single" w:sz="4" w:space="0" w:color="E6EEF2"/>
+              <w:left w:val="single" w:sz="4" w:space="0" w:color="E6EEF2"/>
+              <w:bottom w:val="single" w:sz="4" w:space="0" w:color="E6EEF2"/>
+              <w:right w:val="single" w:sz="4" w:space="0" w:color="E6EEF2"/>
+            </w:tcBorders>
+            <w:tcMar>
+              <w:top w:w="60" w:type="dxa"/>
+              <w:left w:w="80" w:type="dxa"/>
+              <w:bottom w:w="60" w:type="dxa"/>
+              <w:right w:w="80" w:type="dxa"/>
+            </w:tcMar>
+          </w:tcPr>
+          <w:p>
+            <w:pPr>
+              <w:spacing w:after="0" w:line="259" w:lineRule="auto"/>
+            </w:pPr>
+            <w:r>
+              <w:rPr>
+                <w:sz w:val="20"/>
+              </w:rPr>
+              <w:t>September 29, 2026</w:t>
+            </w:r>
+          </w:p>
+        </w:tc>
+        <w:tc>
+          <w:tcPr>
+            <w:tcW w:w="3137" w:type="dxa"/>
+            <w:tcBorders>
+              <w:top w:val="single" w:sz="4" w:space="0" w:color="E6EEF2"/>
+              <w:left w:val="single" w:sz="4" w:space="0" w:color="E6EEF2"/>
+              <w:bottom w:val="single" w:sz="4" w:space="0" w:color="E6EEF2"/>
+              <w:right w:val="single" w:sz="4" w:space="0" w:color="E6EEF2"/>
+            </w:tcBorders>
+            <w:tcMar>
+              <w:top w:w="60" w:type="dxa"/>
+              <w:left w:w="80" w:type="dxa"/>
+              <w:bottom w:w="60" w:type="dxa"/>
+              <w:right w:w="80" w:type="dxa"/>
+            </w:tcMar>
+          </w:tcPr>
+          <w:p>
+            <w:pPr>
+              <w:spacing w:after="0" w:line="259" w:lineRule="auto"/>
+            </w:pPr>
+            <w:r>
+              <w:rPr>
+                <w:sz w:val="20"/>
+              </w:rPr>
+              <w:t>Later requests are kept in the plan, in phases. The first delivery stays the baseline.</w:t>
+            </w:r>
+          </w:p>
+        </w:tc>
+      </w:tr>
+      <w:tr>
+        <w:trPr>
+          <w:cantSplit/>
+          <w:jc w:val="center"/>
+        </w:trPr>
+        <w:tc>
+          <w:tcPr>
+            <w:tcW w:w="3137" w:type="dxa"/>
+            <w:tcBorders>
+              <w:top w:val="single" w:sz="4" w:space="0" w:color="E6EEF2"/>
+              <w:left w:val="single" w:sz="4" w:space="0" w:color="E6EEF2"/>
+              <w:bottom w:val="single" w:sz="4" w:space="0" w:color="E6EEF2"/>
+              <w:right w:val="single" w:sz="4" w:space="0" w:color="E6EEF2"/>
+            </w:tcBorders>
+            <w:tcMar>
+              <w:top w:w="60" w:type="dxa"/>
+              <w:left w:w="80" w:type="dxa"/>
+              <w:bottom w:w="60" w:type="dxa"/>
+              <w:right w:w="80" w:type="dxa"/>
+            </w:tcMar>
+          </w:tcPr>
+          <w:p>
+            <w:pPr>
+              <w:spacing w:after="0" w:line="259" w:lineRule="auto"/>
+            </w:pPr>
+            <w:r>
+              <w:rPr>
+                <w:sz w:val="20"/>
+              </w:rPr>
+              <w:t>1.3</w:t>
+            </w:r>
+          </w:p>
+        </w:tc>
+        <w:tc>
+          <w:tcPr>
+            <w:tcW w:w="3137" w:type="dxa"/>
+            <w:tcBorders>
+              <w:top w:val="single" w:sz="4" w:space="0" w:color="E6EEF2"/>
+              <w:left w:val="single" w:sz="4" w:space="0" w:color="E6EEF2"/>
+              <w:bottom w:val="single" w:sz="4" w:space="0" w:color="E6EEF2"/>
+              <w:right w:val="single" w:sz="4" w:space="0" w:color="E6EEF2"/>
+            </w:tcBorders>
+            <w:tcMar>
+              <w:top w:w="60" w:type="dxa"/>
+              <w:left w:w="80" w:type="dxa"/>
+              <w:bottom w:w="60" w:type="dxa"/>
+              <w:right w:w="80" w:type="dxa"/>
+            </w:tcMar>
+          </w:tcPr>
+          <w:p>
+            <w:pPr>
+              <w:spacing w:after="0" w:line="259" w:lineRule="auto"/>
+            </w:pPr>
+            <w:r>
+              <w:rPr>
+                <w:sz w:val="20"/>
+              </w:rPr>
+              <w:t>September 29, 2026</w:t>
+            </w:r>
+          </w:p>
+        </w:tc>
+        <w:tc>
+          <w:tcPr>
+            <w:tcW w:w="3137" w:type="dxa"/>
+            <w:tcBorders>
+              <w:top w:val="single" w:sz="4" w:space="0" w:color="E6EEF2"/>
+              <w:left w:val="single" w:sz="4" w:space="0" w:color="E6EEF2"/>
+              <w:bottom w:val="single" w:sz="4" w:space="0" w:color="E6EEF2"/>
+              <w:right w:val="single" w:sz="4" w:space="0" w:color="E6EEF2"/>
+            </w:tcBorders>
+            <w:tcMar>
+              <w:top w:w="60" w:type="dxa"/>
+              <w:left w:w="80" w:type="dxa"/>
+              <w:bottom w:w="60" w:type="dxa"/>
+              <w:right w:w="80" w:type="dxa"/>
+            </w:tcMar>
+          </w:tcPr>
+          <w:p>
+            <w:pPr>
+              <w:spacing w:after="0" w:line="259" w:lineRule="auto"/>
+            </w:pPr>
+            <w:r>
+              <w:rPr>
+                <w:sz w:val="20"/>
+              </w:rPr>
+              <w:t>The plan is four sprints of two weeks. All three phases finish in two months.</w:t>
+            </w:r>
+          </w:p>
+        </w:tc>
+      </w:tr>
     </w:tbl>
     <w:p>
       <w:pPr>
@@ -387,7 +562,7 @@
         <w:spacing w:before="40" w:after="160"/>
       </w:pPr>
       <w:r>
-        <w:t>When you sign, you agree the work, the way we will do it, and the eight-week plan in Section 13.</w:t>
+        <w:t>When you sign, you agree the work, the way we will do it, and the two-month plan in Section 13.</w:t>
       </w:r>
     </w:p>
     <w:p>
@@ -506,7 +681,7 @@
         <w:spacing w:before="40" w:after="160"/>
       </w:pPr>
       <w:r>
-        <w:t>The work has four steps. Steps 1, 2, and 3 are the first delivery. Step 4 comes later, and it is written here so that limit is clear. From the day you sign, we plan to finish the first delivery in eight weeks. The plan is in Section 13. The price choices you sent on September 28, 2026 are included in that plan.</w:t>
+        <w:t>The work has four sprints of two weeks. Sprints 1 and 2 are the baseline. Sprint 3 is Phase 2. Sprint 4 is Phase 3. From the day you sign, we plan to finish all three phases in two months. The plan is in Section 13.</w:t>
       </w:r>
     </w:p>
     <w:p>
@@ -929,7 +1104,7 @@
               <w:rPr>
                 <w:sz w:val="20"/>
               </w:rPr>
-              <w:t>Steps 1, 2, and 3. This is what the eight-week plan covers.</w:t>
+              <w:t>Sprints 1 and 2. The baseline. Steps 1, 2, and 3.</w:t>
             </w:r>
           </w:p>
         </w:tc>
@@ -1891,11 +2066,9 @@
           <w:b/>
           <w:color w:val="1798B0"/>
         </w:rPr>
-        <w:t xml:space="preserve">•  </w:t>
-      </w:r>
-      <w:r>
-        <w:t>Paid extras, such as a jeep for Saiful Muluk or Fairy Meadows</w:t>
-      </w:r>
+        <w:t>•  Paid extras, such as a jeep, a musical night, a BBQ and bonfire, fireworks, a honeymoon setup, or flowers. The office types the name and the amount.</w:t>
+      </w:r>
+      <w:r/>
     </w:p>
     <w:p>
       <w:pPr>
@@ -2098,11 +2271,9 @@
           <w:b/>
           <w:color w:val="1798B0"/>
         </w:rPr>
-        <w:t xml:space="preserve">•  </w:t>
-      </w:r>
-      <w:r>
-        <w:t>Deleting your Excel file. The file stays with you. We copy the prices from it.</w:t>
-      </w:r>
+        <w:t>Deleting your Excel file. The file stays with you. We copy the prices from it. The first delivery is the baseline. Requests that need a new price rule, or a new product, are Phase 2 in sprint 3, or Phase 3 in sprint 4. They are not dropped. They are not part of the first month.</w:t>
+      </w:r>
+      <w:r/>
     </w:p>
     <w:p>
       <w:pPr>
@@ -5747,6 +5918,14 @@
     </w:p>
     <w:p>
       <w:pPr>
+        <w:spacing w:before="40" w:after="160"/>
+      </w:pPr>
+      <w:r>
+        <w:t>A guest on the website sees one total. The guest does not see each breakfast line, and the guest does not see the profit. A staff member who is logged in sees each line and the profit.</w:t>
+      </w:r>
+    </w:p>
+    <w:p>
+      <w:pPr>
         <w:keepNext/>
         <w:pBdr>
           <w:bottom w:val="single" w:sz="10" w:space="1" w:color="1798B0"/>
@@ -6658,7 +6837,7 @@
           <w:color w:val="0F4C68"/>
           <w:sz w:val="26"/>
         </w:rPr>
-        <w:t>Step 4. Later work (not part of the first delivery)</w:t>
+        <w:t>Phase 2. Sprint 3 (not part of the baseline)</w:t>
       </w:r>
     </w:p>
     <w:p>
@@ -6714,11 +6893,9 @@
           <w:b/>
           <w:color w:val="1798B0"/>
         </w:rPr>
-        <w:t xml:space="preserve">•  </w:t>
-      </w:r>
-      <w:r>
-        <w:t>Trip types: Comfort, Luxury, Adventure, Exploration</w:t>
-      </w:r>
+        <w:t>•  Trip labels: Comfort, Luxury, Adventure, and Exploration</w:t>
+      </w:r>
+      <w:r/>
     </w:p>
     <w:p>
       <w:pPr>
@@ -6741,7 +6918,111 @@
         <w:spacing w:before="40" w:after="160"/>
       </w:pPr>
       <w:r>
-        <w:t>This step needs a separate written approval after the first delivery is in daily use. It is listed here so it is not treated as part of Steps 1 to 3.</w:t>
+        <w:t>This is sprint 3, weeks 5 and 6. It starts after sprint 2 is accepted.</w:t>
+      </w:r>
+    </w:p>
+    <w:p>
+      <w:pPr>
+        <w:spacing w:before="40" w:after="160"/>
+      </w:pPr>
+      <w:r>
+        <w:t>Phase 3. Sprint 4 (major enhancements)</w:t>
+      </w:r>
+    </w:p>
+    <w:p>
+      <w:pPr>
+        <w:spacing w:before="40" w:after="160"/>
+      </w:pPr>
+      <w:r>
+        <w:t>Result. Changes to how a price is built, and extra copies of a quote. These sit on top of the baseline. They do not replace it.</w:t>
+      </w:r>
+    </w:p>
+    <w:p>
+      <w:pPr>
+        <w:spacing w:before="40" w:after="160"/>
+      </w:pPr>
+      <w:r>
+        <w:t>What you would receive</w:t>
+      </w:r>
+    </w:p>
+    <w:p>
+      <w:pPr>
+        <w:spacing w:before="40" w:after="160"/>
+      </w:pPr>
+      <w:r>
+        <w:t>•  Season plans. Blossom is in April, and the exact April dates still need to be named. Summer is May through September. Autumn is 10 October through 30 November. Winter is 1 December through 30 March. When a month is chosen, the matching plan is used.</w:t>
+      </w:r>
+    </w:p>
+    <w:p>
+      <w:pPr>
+        <w:spacing w:before="40" w:after="160"/>
+      </w:pPr>
+      <w:r>
+        <w:t>•  Fuel by distance. A Gli car uses 1 liter for each 14 km. A Prado uses 1 liter for each 5 km. The office keeps one petrol rate and one diesel rate. A change to that rate updates every quote. Each day uses the kilometers for that route.</w:t>
+      </w:r>
+    </w:p>
+    <w:p>
+      <w:pPr>
+        <w:spacing w:before="40" w:after="160"/>
+      </w:pPr>
+      <w:r>
+        <w:t>•  A guide price the office can edit by area. A local guide for Islamabad or Murree can cost less than a guide for Skardu or Hunza.</w:t>
+      </w:r>
+    </w:p>
+    <w:p>
+      <w:pPr>
+        <w:spacing w:before="40" w:after="160"/>
+      </w:pPr>
+      <w:r>
+        <w:t>•  Entry tickets stored in the office and added from the day's plan, instead of one air entry amount for the whole trip.</w:t>
+      </w:r>
+    </w:p>
+    <w:p>
+      <w:pPr>
+        <w:spacing w:before="40" w:after="160"/>
+      </w:pPr>
+      <w:r>
+        <w:t>•  A tracking code on each quote a guest builds or downloads, so the office can find that quote later.</w:t>
+      </w:r>
+    </w:p>
+    <w:p>
+      <w:pPr>
+        <w:spacing w:before="40" w:after="160"/>
+      </w:pPr>
+      <w:r>
+        <w:t>•  A second copy for the driver and the field team. It has the services, dates, flight route, air ticket details, vehicles, hotels, and what is included. It has no prices.</w:t>
+      </w:r>
+    </w:p>
+    <w:p>
+      <w:pPr>
+        <w:spacing w:before="40" w:after="160"/>
+      </w:pPr>
+      <w:r>
+        <w:t>•  A PDF or image download of the guest quote</w:t>
+      </w:r>
+    </w:p>
+    <w:p>
+      <w:pPr>
+        <w:spacing w:before="40" w:after="160"/>
+      </w:pPr>
+      <w:r>
+        <w:t>•  A download of the live prices back to Excel</w:t>
+      </w:r>
+    </w:p>
+    <w:p>
+      <w:pPr>
+        <w:spacing w:before="40" w:after="160"/>
+      </w:pPr>
+      <w:r>
+        <w:t>In the baseline, the air sticker is 500 rupees times the number of rooms. In sprint 4, the sticker follows the number of vehicles.</w:t>
+      </w:r>
+    </w:p>
+    <w:p>
+      <w:pPr>
+        <w:spacing w:before="40" w:after="160"/>
+      </w:pPr>
+      <w:r>
+        <w:t>Phase 3 is sprint 4, in weeks 7 and 8. It starts after sprint 3 is accepted.</w:t>
       </w:r>
     </w:p>
     <w:p>
@@ -6765,7 +7046,7 @@
         <w:spacing w:before="40" w:after="160"/>
       </w:pPr>
       <w:r>
-        <w:t>The weeks start on the day you sign Section 23. The plan is for one full-time developer. It also allows you up to five working days to review each step.</w:t>
+        <w:t>The plan starts on the day you sign Section 23. It is four sprints. Each sprint is two weeks. All three phases finish in two months. The plan is for one full-time developer. The last two working days of each sprint are for your review.</w:t>
       </w:r>
     </w:p>
     <w:p>
@@ -6773,7 +7054,7 @@
         <w:spacing w:before="40" w:after="160"/>
       </w:pPr>
       <w:r>
-        <w:t>The first delivery is Step 1, Step 2, and Step 3. The aim is your acceptance of Step 3 at the end of week 8. If you finish a review sooner, the next step starts sooner. If a review is late, or you add a change, the end date moves by the same number of days.</w:t>
+        <w:t>If you accept a sprint sooner, the next sprint can start sooner. If a review is late, the next sprint starts late by the same number of days.</w:t>
       </w:r>
     </w:p>
     <w:tbl>
@@ -6820,7 +7101,7 @@
                 <w:color w:val="FFFFFF"/>
                 <w:sz w:val="20"/>
               </w:rPr>
-              <w:t>Week</w:t>
+              <w:t>Sprint</w:t>
             </w:r>
           </w:p>
         </w:tc>
@@ -6851,7 +7132,7 @@
                 <w:color w:val="FFFFFF"/>
                 <w:sz w:val="20"/>
               </w:rPr>
-              <w:t>Work</w:t>
+              <w:t>Weeks</w:t>
             </w:r>
           </w:p>
         </w:tc>
@@ -6882,7 +7163,7 @@
                 <w:color w:val="FFFFFF"/>
                 <w:sz w:val="20"/>
               </w:rPr>
-              <w:t>Working days</w:t>
+              <w:t>What is delivered</w:t>
             </w:r>
           </w:p>
         </w:tc>
@@ -6892,6 +7173,34 @@
           <w:cantSplit/>
           <w:jc w:val="center"/>
         </w:trPr>
+        <w:tc>
+          <w:tcPr>
+            <w:tcW w:w="3137" w:type="dxa"/>
+            <w:tcBorders>
+              <w:top w:val="single" w:sz="4" w:space="0" w:color="E6EEF2"/>
+              <w:left w:val="single" w:sz="4" w:space="0" w:color="E6EEF2"/>
+              <w:bottom w:val="single" w:sz="4" w:space="0" w:color="E6EEF2"/>
+              <w:right w:val="single" w:sz="4" w:space="0" w:color="E6EEF2"/>
+            </w:tcBorders>
+            <w:tcMar>
+              <w:top w:w="60" w:type="dxa"/>
+              <w:left w:w="80" w:type="dxa"/>
+              <w:bottom w:w="60" w:type="dxa"/>
+              <w:right w:w="80" w:type="dxa"/>
+            </w:tcMar>
+          </w:tcPr>
+          <w:p>
+            <w:pPr>
+              <w:spacing w:after="0" w:line="259" w:lineRule="auto"/>
+            </w:pPr>
+            <w:r>
+              <w:rPr>
+                <w:sz w:val="20"/>
+              </w:rPr>
+              <w:t>1</w:t>
+            </w:r>
+          </w:p>
+        </w:tc>
         <w:tc>
           <w:tcPr>
             <w:tcW w:w="3137" w:type="dxa"/>
@@ -6944,35 +7253,7 @@
               <w:rPr>
                 <w:sz w:val="20"/>
               </w:rPr>
-              <w:t>Step 1. Office login, three roles, and editing of public pages</w:t>
-            </w:r>
-          </w:p>
-        </w:tc>
-        <w:tc>
-          <w:tcPr>
-            <w:tcW w:w="3137" w:type="dxa"/>
-            <w:tcBorders>
-              <w:top w:val="single" w:sz="4" w:space="0" w:color="E6EEF2"/>
-              <w:left w:val="single" w:sz="4" w:space="0" w:color="E6EEF2"/>
-              <w:bottom w:val="single" w:sz="4" w:space="0" w:color="E6EEF2"/>
-              <w:right w:val="single" w:sz="4" w:space="0" w:color="E6EEF2"/>
-            </w:tcBorders>
-            <w:tcMar>
-              <w:top w:w="60" w:type="dxa"/>
-              <w:left w:w="80" w:type="dxa"/>
-              <w:bottom w:w="60" w:type="dxa"/>
-              <w:right w:w="80" w:type="dxa"/>
-            </w:tcMar>
-          </w:tcPr>
-          <w:p>
-            <w:pPr>
-              <w:spacing w:after="0" w:line="259" w:lineRule="auto"/>
-            </w:pPr>
-            <w:r>
-              <w:rPr>
-                <w:sz w:val="20"/>
-              </w:rPr>
-              <w:t>10</w:t>
+              <w:t>Baseline. Office login, three roles, and editing of public pages.</w:t>
             </w:r>
           </w:p>
         </w:tc>
@@ -7007,7 +7288,7 @@
               <w:rPr>
                 <w:sz w:val="20"/>
               </w:rPr>
-              <w:t>3</w:t>
+              <w:t>2</w:t>
             </w:r>
           </w:p>
         </w:tc>
@@ -7036,7 +7317,7 @@
               <w:rPr>
                 <w:sz w:val="20"/>
               </w:rPr>
-              <w:t>Your review of Step 1</w:t>
+              <w:t>3 and 4</w:t>
             </w:r>
           </w:p>
         </w:tc>
@@ -7065,7 +7346,7 @@
               <w:rPr>
                 <w:sz w:val="20"/>
               </w:rPr>
-              <w:t>up to 5</w:t>
+              <w:t>Baseline. Excel prices, quote rules, one-night and one-day edits, and saved guest requests.</w:t>
             </w:r>
           </w:p>
         </w:tc>
@@ -7099,7 +7380,7 @@
               <w:rPr>
                 <w:sz w:val="20"/>
               </w:rPr>
-              <w:t>4 and 5</w:t>
+              <w:t>3</w:t>
             </w:r>
           </w:p>
         </w:tc>
@@ -7127,7 +7408,7 @@
               <w:rPr>
                 <w:sz w:val="20"/>
               </w:rPr>
-              <w:t>Step 2. Excel prices, price rules, one-night and one-day edits, and the test quote</w:t>
+              <w:t>5 and 6</w:t>
             </w:r>
           </w:p>
         </w:tc>
@@ -7155,7 +7436,7 @@
               <w:rPr>
                 <w:sz w:val="20"/>
               </w:rPr>
-              <w:t>10</w:t>
+              <w:t>Phase 2. Hours on each stop, trip labels, and the Kashmir, Swat, and Chitral jeep products.</w:t>
             </w:r>
           </w:p>
         </w:tc>
@@ -7190,7 +7471,7 @@
               <w:rPr>
                 <w:sz w:val="20"/>
               </w:rPr>
-              <w:t>6</w:t>
+              <w:t>4</w:t>
             </w:r>
           </w:p>
         </w:tc>
@@ -7219,7 +7500,7 @@
               <w:rPr>
                 <w:sz w:val="20"/>
               </w:rPr>
-              <w:t>Your review of Step 2</w:t>
+              <w:t>7 and 8</w:t>
             </w:r>
           </w:p>
         </w:tc>
@@ -7248,190 +7529,7 @@
               <w:rPr>
                 <w:sz w:val="20"/>
               </w:rPr>
-              <w:t>up to 5</w:t>
-            </w:r>
-          </w:p>
-        </w:tc>
-      </w:tr>
-      <w:tr>
-        <w:trPr>
-          <w:cantSplit/>
-          <w:jc w:val="center"/>
-        </w:trPr>
-        <w:tc>
-          <w:tcPr>
-            <w:tcW w:w="3137" w:type="dxa"/>
-            <w:tcBorders>
-              <w:top w:val="single" w:sz="4" w:space="0" w:color="E6EEF2"/>
-              <w:left w:val="single" w:sz="4" w:space="0" w:color="E6EEF2"/>
-              <w:bottom w:val="single" w:sz="4" w:space="0" w:color="E6EEF2"/>
-              <w:right w:val="single" w:sz="4" w:space="0" w:color="E6EEF2"/>
-            </w:tcBorders>
-            <w:tcMar>
-              <w:top w:w="60" w:type="dxa"/>
-              <w:left w:w="80" w:type="dxa"/>
-              <w:bottom w:w="60" w:type="dxa"/>
-              <w:right w:w="80" w:type="dxa"/>
-            </w:tcMar>
-          </w:tcPr>
-          <w:p>
-            <w:pPr>
-              <w:spacing w:after="0" w:line="259" w:lineRule="auto"/>
-            </w:pPr>
-            <w:r>
-              <w:rPr>
-                <w:sz w:val="20"/>
-              </w:rPr>
-              <w:t>7</w:t>
-            </w:r>
-          </w:p>
-        </w:tc>
-        <w:tc>
-          <w:tcPr>
-            <w:tcW w:w="3137" w:type="dxa"/>
-            <w:tcBorders>
-              <w:top w:val="single" w:sz="4" w:space="0" w:color="E6EEF2"/>
-              <w:left w:val="single" w:sz="4" w:space="0" w:color="E6EEF2"/>
-              <w:bottom w:val="single" w:sz="4" w:space="0" w:color="E6EEF2"/>
-              <w:right w:val="single" w:sz="4" w:space="0" w:color="E6EEF2"/>
-            </w:tcBorders>
-            <w:tcMar>
-              <w:top w:w="60" w:type="dxa"/>
-              <w:left w:w="80" w:type="dxa"/>
-              <w:bottom w:w="60" w:type="dxa"/>
-              <w:right w:w="80" w:type="dxa"/>
-            </w:tcMar>
-          </w:tcPr>
-          <w:p>
-            <w:pPr>
-              <w:spacing w:after="0" w:line="259" w:lineRule="auto"/>
-            </w:pPr>
-            <w:r>
-              <w:rPr>
-                <w:sz w:val="20"/>
-              </w:rPr>
-              <w:t>Step 3. Saved guest requests, with WhatsApp kept</w:t>
-            </w:r>
-          </w:p>
-        </w:tc>
-        <w:tc>
-          <w:tcPr>
-            <w:tcW w:w="3137" w:type="dxa"/>
-            <w:tcBorders>
-              <w:top w:val="single" w:sz="4" w:space="0" w:color="E6EEF2"/>
-              <w:left w:val="single" w:sz="4" w:space="0" w:color="E6EEF2"/>
-              <w:bottom w:val="single" w:sz="4" w:space="0" w:color="E6EEF2"/>
-              <w:right w:val="single" w:sz="4" w:space="0" w:color="E6EEF2"/>
-            </w:tcBorders>
-            <w:tcMar>
-              <w:top w:w="60" w:type="dxa"/>
-              <w:left w:w="80" w:type="dxa"/>
-              <w:bottom w:w="60" w:type="dxa"/>
-              <w:right w:w="80" w:type="dxa"/>
-            </w:tcMar>
-          </w:tcPr>
-          <w:p>
-            <w:pPr>
-              <w:spacing w:after="0" w:line="259" w:lineRule="auto"/>
-            </w:pPr>
-            <w:r>
-              <w:rPr>
-                <w:sz w:val="20"/>
-              </w:rPr>
-              <w:t>5</w:t>
-            </w:r>
-          </w:p>
-        </w:tc>
-      </w:tr>
-      <w:tr>
-        <w:trPr>
-          <w:cantSplit/>
-          <w:jc w:val="center"/>
-        </w:trPr>
-        <w:tc>
-          <w:tcPr>
-            <w:tcW w:w="3137" w:type="dxa"/>
-            <w:tcBorders>
-              <w:top w:val="single" w:sz="4" w:space="0" w:color="E6EEF2"/>
-              <w:left w:val="single" w:sz="4" w:space="0" w:color="E6EEF2"/>
-              <w:bottom w:val="single" w:sz="4" w:space="0" w:color="E6EEF2"/>
-              <w:right w:val="single" w:sz="4" w:space="0" w:color="E6EEF2"/>
-            </w:tcBorders>
-            <w:shd w:val="clear" w:color="auto" w:fill="F4F8FA"/>
-            <w:tcMar>
-              <w:top w:w="60" w:type="dxa"/>
-              <w:left w:w="80" w:type="dxa"/>
-              <w:bottom w:w="60" w:type="dxa"/>
-              <w:right w:w="80" w:type="dxa"/>
-            </w:tcMar>
-          </w:tcPr>
-          <w:p>
-            <w:pPr>
-              <w:spacing w:after="0" w:line="259" w:lineRule="auto"/>
-            </w:pPr>
-            <w:r>
-              <w:rPr>
-                <w:sz w:val="20"/>
-              </w:rPr>
-              <w:t>8</w:t>
-            </w:r>
-          </w:p>
-        </w:tc>
-        <w:tc>
-          <w:tcPr>
-            <w:tcW w:w="3137" w:type="dxa"/>
-            <w:tcBorders>
-              <w:top w:val="single" w:sz="4" w:space="0" w:color="E6EEF2"/>
-              <w:left w:val="single" w:sz="4" w:space="0" w:color="E6EEF2"/>
-              <w:bottom w:val="single" w:sz="4" w:space="0" w:color="E6EEF2"/>
-              <w:right w:val="single" w:sz="4" w:space="0" w:color="E6EEF2"/>
-            </w:tcBorders>
-            <w:shd w:val="clear" w:color="auto" w:fill="F4F8FA"/>
-            <w:tcMar>
-              <w:top w:w="60" w:type="dxa"/>
-              <w:left w:w="80" w:type="dxa"/>
-              <w:bottom w:w="60" w:type="dxa"/>
-              <w:right w:w="80" w:type="dxa"/>
-            </w:tcMar>
-          </w:tcPr>
-          <w:p>
-            <w:pPr>
-              <w:spacing w:after="0" w:line="259" w:lineRule="auto"/>
-            </w:pPr>
-            <w:r>
-              <w:rPr>
-                <w:sz w:val="20"/>
-              </w:rPr>
-              <w:t>Your review of Step 3, and acceptance of the first delivery</w:t>
-            </w:r>
-          </w:p>
-        </w:tc>
-        <w:tc>
-          <w:tcPr>
-            <w:tcW w:w="3137" w:type="dxa"/>
-            <w:tcBorders>
-              <w:top w:val="single" w:sz="4" w:space="0" w:color="E6EEF2"/>
-              <w:left w:val="single" w:sz="4" w:space="0" w:color="E6EEF2"/>
-              <w:bottom w:val="single" w:sz="4" w:space="0" w:color="E6EEF2"/>
-              <w:right w:val="single" w:sz="4" w:space="0" w:color="E6EEF2"/>
-            </w:tcBorders>
-            <w:shd w:val="clear" w:color="auto" w:fill="F4F8FA"/>
-            <w:tcMar>
-              <w:top w:w="60" w:type="dxa"/>
-              <w:left w:w="80" w:type="dxa"/>
-              <w:bottom w:w="60" w:type="dxa"/>
-              <w:right w:w="80" w:type="dxa"/>
-            </w:tcMar>
-          </w:tcPr>
-          <w:p>
-            <w:pPr>
-              <w:spacing w:after="0" w:line="259" w:lineRule="auto"/>
-            </w:pPr>
-            <w:r>
-              <w:rPr>
-                <w:sz w:val="20"/>
-              </w:rPr>
-              <w:t>up to 5</w:t>
+              <w:t>Phase 3. The major enhancements in Section 12.</w:t>
             </w:r>
           </w:p>
         </w:tc>
@@ -7447,15 +7545,7 @@
         <w:spacing w:before="40" w:after="160"/>
       </w:pPr>
       <w:r>
-        <w:t>Inside these eight weeks, 25 working days are for building. The other 15 working days are for your review. They are not extra build days.</w:t>
-      </w:r>
-    </w:p>
-    <w:p>
-      <w:pPr>
-        <w:spacing w:before="40" w:after="160"/>
-      </w:pPr>
-      <w:r>
-        <w:t>Step 4 is not inside the eight weeks. After the first delivery is in use, and after a separate written approval, Step 4 is another 10 working days of build, plus up to 5 working days of review.</w:t>
+        <w:t>The baseline is accepted at the end of sprint 2. Phase 2 is accepted at the end of sprint 3. Phase 3 is accepted at the end of sprint 4.</w:t>
       </w:r>
     </w:p>
     <w:p>
@@ -8892,7 +8982,7 @@
         <w:spacing w:before="40" w:after="160"/>
       </w:pPr>
       <w:r>
-        <w:t>By signing, you confirm that Sections 6, 7, 8, 9, 10, 11, 12, 13, 14, 15, 16, 17, 18, and 19 are the agreed first delivery, the agreed schedule, and the agreed rules for setup, quality, training, support, ownership, updates, and assumptions.</w:t>
+        <w:t>By signing, you confirm the baseline in sprints 1 and 2, and the later work in sprints 3 and 4, as written in Sections 6, 7, 8, 9, 10, 11, 12, and 13. You also confirm the rules in Sections 14, 15, 16, 17, 18, and 19.</w:t>
       </w:r>
     </w:p>
     <w:p>
@@ -8900,7 +8990,7 @@
         <w:spacing w:before="40" w:after="160"/>
       </w:pPr>
       <w:r>
-        <w:t>Section 6.2 and Step 4 are not part of that first delivery.</w:t>
+        <w:t>The baseline is sprints 1 and 2. Sprint 3 is Phase 2. Sprint 4 is Phase 3. A new look, card payment, and a guest login are not part of this plan.</w:t>
       </w:r>
     </w:p>
     <w:tbl>
@@ -9275,7 +9365,7 @@
           <w:rFonts w:ascii="Space Grotesk" w:eastAsia="Space Grotesk" w:hAnsi="Space Grotesk"/>
           <w:b/>
         </w:rPr>
-        <w:t>End of document. TWM-SOW-001. Version 1.1. September 28, 2026.</w:t>
+        <w:t>End of document. TWM-SOW-001. Version 1.3. September 29, 2026.</w:t>
       </w:r>
     </w:p>
     <w:sectPr>

</xml_diff>